<commit_message>
Parte - Documentação - Objetivos
Texto para objetivo geral e especifico criado, falta ajustar a formatação para o padrão do documento
</commit_message>
<xml_diff>
--- a/documentacao/Planejamento/TCC_Completo_rascunho.docx
+++ b/documentacao/Planejamento/TCC_Completo_rascunho.docx
@@ -976,8 +976,8 @@
           <w:rFonts w:ascii="Arial" w:hAnsi="Arial" w:cs="Arial"/>
           <w:b/>
           <w:color w:val="auto"/>
-          <w:sz w:val="24"/>
-          <w:szCs w:val="24"/>
+          <w:sz w:val="28"/>
+          <w:szCs w:val="28"/>
           <w:u w:val="single"/>
         </w:rPr>
       </w:pPr>
@@ -987,8 +987,8 @@
           <w:rFonts w:ascii="Arial" w:hAnsi="Arial" w:cs="Arial"/>
           <w:b/>
           <w:color w:val="auto"/>
-          <w:sz w:val="24"/>
-          <w:szCs w:val="24"/>
+          <w:sz w:val="28"/>
+          <w:szCs w:val="28"/>
           <w:u w:val="single"/>
         </w:rPr>
         <w:lastRenderedPageBreak/>
@@ -1002,6 +1002,8 @@
         <w:jc w:val="both"/>
         <w:rPr>
           <w:rFonts w:ascii="Arial" w:hAnsi="Arial" w:cs="Arial"/>
+          <w:sz w:val="28"/>
+          <w:szCs w:val="28"/>
         </w:rPr>
       </w:pPr>
     </w:p>
@@ -1016,6 +1018,8 @@
           <w:rFonts w:ascii="Arial" w:hAnsi="Arial" w:cs="Arial"/>
           <w:b/>
           <w:color w:val="000000" w:themeColor="text1"/>
+          <w:sz w:val="28"/>
+          <w:szCs w:val="28"/>
         </w:rPr>
       </w:pPr>
       <w:bookmarkStart w:id="4" w:name="_Toc215588546"/>
@@ -1024,6 +1028,8 @@
           <w:rFonts w:ascii="Arial" w:hAnsi="Arial" w:cs="Arial"/>
           <w:b/>
           <w:color w:val="000000" w:themeColor="text1"/>
+          <w:sz w:val="28"/>
+          <w:szCs w:val="28"/>
         </w:rPr>
         <w:t>Objetivos Gerais</w:t>
       </w:r>
@@ -1031,10 +1037,255 @@
     </w:p>
     <w:p>
       <w:pPr>
-        <w:pStyle w:val="NormalWeb"/>
-        <w:jc w:val="both"/>
-        <w:rPr>
-          <w:rFonts w:ascii="Arial" w:hAnsi="Arial" w:cs="Arial"/>
+        <w:rPr>
+          <w:sz w:val="28"/>
+          <w:szCs w:val="28"/>
+        </w:rPr>
+      </w:pPr>
+    </w:p>
+    <w:p>
+      <w:pPr>
+        <w:spacing w:line="285" w:lineRule="atLeast"/>
+        <w:ind w:firstLine="0"/>
+        <w:jc w:val="left"/>
+        <w:rPr>
+          <w:rFonts w:eastAsia="Times New Roman" w:cs="Arial"/>
+          <w:sz w:val="28"/>
+          <w:szCs w:val="28"/>
+          <w:lang w:eastAsia="pt-BR"/>
+        </w:rPr>
+      </w:pPr>
+      <w:r>
+        <w:rPr>
+          <w:rFonts w:eastAsia="Times New Roman" w:cs="Arial"/>
+          <w:sz w:val="28"/>
+          <w:szCs w:val="28"/>
+          <w:lang w:eastAsia="pt-BR"/>
+        </w:rPr>
+        <w:t xml:space="preserve">Criar um sistema que permite a população denunciar problemas urbanos (buracos no asfalto, </w:t>
+      </w:r>
+      <w:r>
+        <w:rPr>
+          <w:rFonts w:eastAsia="Times New Roman" w:cs="Arial"/>
+          <w:sz w:val="28"/>
+          <w:szCs w:val="28"/>
+          <w:lang w:eastAsia="pt-BR"/>
+        </w:rPr>
+        <w:t>semáforos</w:t>
+      </w:r>
+      <w:r>
+        <w:rPr>
+          <w:rFonts w:eastAsia="Times New Roman" w:cs="Arial"/>
+          <w:sz w:val="28"/>
+          <w:szCs w:val="28"/>
+          <w:lang w:eastAsia="pt-BR"/>
+        </w:rPr>
+        <w:t xml:space="preserve"> queimados, lixo em local proibido e coisas do </w:t>
+      </w:r>
+      <w:r>
+        <w:rPr>
+          <w:rFonts w:eastAsia="Times New Roman" w:cs="Arial"/>
+          <w:sz w:val="28"/>
+          <w:szCs w:val="28"/>
+          <w:lang w:eastAsia="pt-BR"/>
+        </w:rPr>
+        <w:t>gênero</w:t>
+      </w:r>
+      <w:r>
+        <w:rPr>
+          <w:rFonts w:eastAsia="Times New Roman" w:cs="Arial"/>
+          <w:sz w:val="28"/>
+          <w:szCs w:val="28"/>
+          <w:lang w:eastAsia="pt-BR"/>
+        </w:rPr>
+        <w:t xml:space="preserve">), o mesmo registra a localização do problema, a data da </w:t>
+      </w:r>
+      <w:r>
+        <w:rPr>
+          <w:rFonts w:eastAsia="Times New Roman" w:cs="Arial"/>
+          <w:sz w:val="28"/>
+          <w:szCs w:val="28"/>
+          <w:lang w:eastAsia="pt-BR"/>
+        </w:rPr>
+        <w:t>denúncia</w:t>
+      </w:r>
+      <w:r>
+        <w:rPr>
+          <w:rFonts w:eastAsia="Times New Roman" w:cs="Arial"/>
+          <w:sz w:val="28"/>
+          <w:szCs w:val="28"/>
+          <w:lang w:eastAsia="pt-BR"/>
+        </w:rPr>
+        <w:t xml:space="preserve"> e envia um </w:t>
+      </w:r>
+      <w:r>
+        <w:rPr>
+          <w:rFonts w:eastAsia="Times New Roman" w:cs="Arial"/>
+          <w:sz w:val="28"/>
+          <w:szCs w:val="28"/>
+          <w:lang w:eastAsia="pt-BR"/>
+        </w:rPr>
+        <w:t>e-mail</w:t>
+      </w:r>
+      <w:r>
+        <w:rPr>
+          <w:rFonts w:eastAsia="Times New Roman" w:cs="Arial"/>
+          <w:sz w:val="28"/>
+          <w:szCs w:val="28"/>
+          <w:lang w:eastAsia="pt-BR"/>
+        </w:rPr>
+        <w:t xml:space="preserve"> para os </w:t>
+      </w:r>
+      <w:r>
+        <w:rPr>
+          <w:rFonts w:eastAsia="Times New Roman" w:cs="Arial"/>
+          <w:sz w:val="28"/>
+          <w:szCs w:val="28"/>
+          <w:lang w:eastAsia="pt-BR"/>
+        </w:rPr>
+        <w:t>órgãos</w:t>
+      </w:r>
+      <w:r>
+        <w:rPr>
+          <w:rFonts w:eastAsia="Times New Roman" w:cs="Arial"/>
+          <w:sz w:val="28"/>
+          <w:szCs w:val="28"/>
+          <w:lang w:eastAsia="pt-BR"/>
+        </w:rPr>
+        <w:t xml:space="preserve"> competentes, informando ao </w:t>
+      </w:r>
+      <w:r>
+        <w:rPr>
+          <w:rFonts w:eastAsia="Times New Roman" w:cs="Arial"/>
+          <w:sz w:val="28"/>
+          <w:szCs w:val="28"/>
+          <w:lang w:eastAsia="pt-BR"/>
+        </w:rPr>
+        <w:t>usuário</w:t>
+      </w:r>
+      <w:r>
+        <w:rPr>
+          <w:rFonts w:eastAsia="Times New Roman" w:cs="Arial"/>
+          <w:sz w:val="28"/>
+          <w:szCs w:val="28"/>
+          <w:lang w:eastAsia="pt-BR"/>
+        </w:rPr>
+        <w:t xml:space="preserve"> os </w:t>
+      </w:r>
+      <w:r>
+        <w:rPr>
+          <w:rFonts w:eastAsia="Times New Roman" w:cs="Arial"/>
+          <w:sz w:val="28"/>
+          <w:szCs w:val="28"/>
+          <w:lang w:eastAsia="pt-BR"/>
+        </w:rPr>
+        <w:t>órgãos</w:t>
+      </w:r>
+      <w:r>
+        <w:rPr>
+          <w:rFonts w:eastAsia="Times New Roman" w:cs="Arial"/>
+          <w:sz w:val="28"/>
+          <w:szCs w:val="28"/>
+          <w:lang w:eastAsia="pt-BR"/>
+        </w:rPr>
+        <w:t xml:space="preserve"> competentes.</w:t>
+      </w:r>
+    </w:p>
+    <w:p>
+      <w:pPr>
+        <w:spacing w:line="285" w:lineRule="atLeast"/>
+        <w:ind w:firstLine="0"/>
+        <w:jc w:val="left"/>
+        <w:rPr>
+          <w:rFonts w:eastAsia="Times New Roman" w:cs="Arial"/>
+          <w:sz w:val="28"/>
+          <w:szCs w:val="28"/>
+          <w:lang w:eastAsia="pt-BR"/>
+        </w:rPr>
+      </w:pPr>
+      <w:r>
+        <w:rPr>
+          <w:rFonts w:eastAsia="Times New Roman" w:cs="Arial"/>
+          <w:sz w:val="28"/>
+          <w:szCs w:val="28"/>
+          <w:lang w:eastAsia="pt-BR"/>
+        </w:rPr>
+        <w:t xml:space="preserve">    O sistema deve ajudar a população a denunciar e a cobrar uma solução dos </w:t>
+      </w:r>
+      <w:r>
+        <w:rPr>
+          <w:rFonts w:eastAsia="Times New Roman" w:cs="Arial"/>
+          <w:sz w:val="28"/>
+          <w:szCs w:val="28"/>
+          <w:lang w:eastAsia="pt-BR"/>
+        </w:rPr>
+        <w:t>órgãos</w:t>
+      </w:r>
+      <w:r>
+        <w:rPr>
+          <w:rFonts w:eastAsia="Times New Roman" w:cs="Arial"/>
+          <w:sz w:val="28"/>
+          <w:szCs w:val="28"/>
+          <w:lang w:eastAsia="pt-BR"/>
+        </w:rPr>
+        <w:t xml:space="preserve"> competentes com mais rapidez, sendo um meio de comunicação entre a população e aos </w:t>
+      </w:r>
+      <w:r>
+        <w:rPr>
+          <w:rFonts w:eastAsia="Times New Roman" w:cs="Arial"/>
+          <w:sz w:val="28"/>
+          <w:szCs w:val="28"/>
+          <w:lang w:eastAsia="pt-BR"/>
+        </w:rPr>
+        <w:t>órgãos</w:t>
+      </w:r>
+      <w:r>
+        <w:rPr>
+          <w:rFonts w:eastAsia="Times New Roman" w:cs="Arial"/>
+          <w:sz w:val="28"/>
+          <w:szCs w:val="28"/>
+          <w:lang w:eastAsia="pt-BR"/>
+        </w:rPr>
+        <w:t xml:space="preserve"> </w:t>
+      </w:r>
+      <w:r>
+        <w:rPr>
+          <w:rFonts w:eastAsia="Times New Roman" w:cs="Arial"/>
+          <w:sz w:val="28"/>
+          <w:szCs w:val="28"/>
+          <w:lang w:eastAsia="pt-BR"/>
+        </w:rPr>
+        <w:t>públicos</w:t>
+      </w:r>
+      <w:r>
+        <w:rPr>
+          <w:rFonts w:eastAsia="Times New Roman" w:cs="Arial"/>
+          <w:sz w:val="28"/>
+          <w:szCs w:val="28"/>
+          <w:lang w:eastAsia="pt-BR"/>
+        </w:rPr>
+        <w:t>.</w:t>
+      </w:r>
+    </w:p>
+    <w:p>
+      <w:pPr>
+        <w:pStyle w:val="PargrafodaLista"/>
+        <w:rPr>
+          <w:sz w:val="28"/>
+          <w:szCs w:val="28"/>
+        </w:rPr>
+      </w:pPr>
+      <w:bookmarkStart w:id="5" w:name="_GoBack"/>
+      <w:bookmarkEnd w:id="5"/>
+    </w:p>
+    <w:p>
+      <w:pPr>
+        <w:pStyle w:val="NormalWeb"/>
+        <w:jc w:val="both"/>
+        <w:rPr>
+          <w:rFonts w:ascii="Arial" w:hAnsi="Arial" w:cs="Arial"/>
+          <w:sz w:val="28"/>
+          <w:szCs w:val="28"/>
         </w:rPr>
       </w:pPr>
     </w:p>
@@ -1052,23 +1303,205 @@
           <w:b/>
           <w:bCs/>
           <w:color w:val="000000" w:themeColor="text1"/>
-        </w:rPr>
-      </w:pPr>
-      <w:bookmarkStart w:id="5" w:name="_Hlk236231455"/>
+          <w:sz w:val="28"/>
+          <w:szCs w:val="28"/>
+        </w:rPr>
+      </w:pPr>
+      <w:bookmarkStart w:id="6" w:name="_Hlk236231455"/>
       <w:r>
         <w:rPr>
           <w:rFonts w:cs="Arial"/>
           <w:b/>
           <w:bCs/>
           <w:color w:val="000000" w:themeColor="text1"/>
+          <w:sz w:val="28"/>
+          <w:szCs w:val="28"/>
         </w:rPr>
         <w:t>Objetivos Específicos</w:t>
       </w:r>
     </w:p>
-    <w:bookmarkEnd w:id="5"/>
-    <w:p>
-      <w:pPr>
-        <w:pStyle w:val="NormalWeb"/>
+    <w:bookmarkEnd w:id="6"/>
+    <w:p>
+      <w:pPr>
+        <w:pStyle w:val="NormalWeb"/>
+        <w:numPr>
+          <w:ilvl w:val="0"/>
+          <w:numId w:val="8"/>
+        </w:numPr>
+        <w:jc w:val="both"/>
+        <w:rPr>
+          <w:rFonts w:ascii="Arial" w:hAnsi="Arial" w:cs="Arial"/>
+          <w:sz w:val="28"/>
+          <w:szCs w:val="28"/>
+        </w:rPr>
+      </w:pPr>
+      <w:r>
+        <w:rPr>
+          <w:rFonts w:ascii="Arial" w:hAnsi="Arial" w:cs="Arial"/>
+          <w:sz w:val="28"/>
+          <w:szCs w:val="28"/>
+        </w:rPr>
+        <w:t>Informar os canais de comunicação e os órgãos competentes para a população poder realizar suas denúncias.</w:t>
+      </w:r>
+    </w:p>
+    <w:p>
+      <w:pPr>
+        <w:pStyle w:val="NormalWeb"/>
+        <w:numPr>
+          <w:ilvl w:val="0"/>
+          <w:numId w:val="8"/>
+        </w:numPr>
+        <w:jc w:val="both"/>
+        <w:rPr>
+          <w:rFonts w:ascii="Arial" w:hAnsi="Arial" w:cs="Arial"/>
+          <w:sz w:val="28"/>
+          <w:szCs w:val="28"/>
+        </w:rPr>
+      </w:pPr>
+      <w:r>
+        <w:rPr>
+          <w:rFonts w:ascii="Arial" w:hAnsi="Arial" w:cs="Arial"/>
+          <w:sz w:val="28"/>
+          <w:szCs w:val="28"/>
+        </w:rPr>
+        <w:t>Enviar um e-mail para os órgãos competentes informando sobre a denúncia realizada pela população</w:t>
+      </w:r>
+      <w:r>
+        <w:rPr>
+          <w:rFonts w:ascii="Arial" w:hAnsi="Arial" w:cs="Arial"/>
+          <w:sz w:val="28"/>
+          <w:szCs w:val="28"/>
+        </w:rPr>
+        <w:t>.</w:t>
+      </w:r>
+    </w:p>
+    <w:p>
+      <w:pPr>
+        <w:pStyle w:val="NormalWeb"/>
+        <w:numPr>
+          <w:ilvl w:val="0"/>
+          <w:numId w:val="8"/>
+        </w:numPr>
+        <w:jc w:val="both"/>
+        <w:rPr>
+          <w:rFonts w:ascii="Arial" w:hAnsi="Arial" w:cs="Arial"/>
+          <w:sz w:val="28"/>
+          <w:szCs w:val="28"/>
+        </w:rPr>
+      </w:pPr>
+      <w:r>
+        <w:rPr>
+          <w:rFonts w:ascii="Arial" w:hAnsi="Arial" w:cs="Arial"/>
+          <w:sz w:val="28"/>
+          <w:szCs w:val="28"/>
+        </w:rPr>
+        <w:t>Permitir a população acompanhar o estado da solicitação (a solicitação para os órgãos responsáveis, a resposta do órgão responsável, e todo o processo até a resolução do problema identificado pela população).</w:t>
+      </w:r>
+    </w:p>
+    <w:p>
+      <w:pPr>
+        <w:pStyle w:val="NormalWeb"/>
+        <w:numPr>
+          <w:ilvl w:val="0"/>
+          <w:numId w:val="8"/>
+        </w:numPr>
+        <w:jc w:val="both"/>
+        <w:rPr>
+          <w:rFonts w:ascii="Arial" w:hAnsi="Arial" w:cs="Arial"/>
+          <w:sz w:val="28"/>
+          <w:szCs w:val="28"/>
+        </w:rPr>
+      </w:pPr>
+      <w:r>
+        <w:rPr>
+          <w:rFonts w:ascii="Arial" w:hAnsi="Arial" w:cs="Arial"/>
+          <w:sz w:val="28"/>
+          <w:szCs w:val="28"/>
+        </w:rPr>
+        <w:t xml:space="preserve">Permitir a resposta do órgão competente </w:t>
+      </w:r>
+      <w:r>
+        <w:rPr>
+          <w:rFonts w:ascii="Arial" w:hAnsi="Arial" w:cs="Arial"/>
+          <w:sz w:val="28"/>
+          <w:szCs w:val="28"/>
+        </w:rPr>
+        <w:t>sobre o processo da resolução do problema.</w:t>
+      </w:r>
+    </w:p>
+    <w:p>
+      <w:pPr>
+        <w:pStyle w:val="NormalWeb"/>
+        <w:numPr>
+          <w:ilvl w:val="0"/>
+          <w:numId w:val="8"/>
+        </w:numPr>
+        <w:jc w:val="both"/>
+        <w:rPr>
+          <w:rFonts w:ascii="Arial" w:hAnsi="Arial" w:cs="Arial"/>
+          <w:sz w:val="28"/>
+          <w:szCs w:val="28"/>
+        </w:rPr>
+      </w:pPr>
+      <w:r>
+        <w:rPr>
+          <w:rFonts w:ascii="Arial" w:hAnsi="Arial" w:cs="Arial"/>
+          <w:sz w:val="28"/>
+          <w:szCs w:val="28"/>
+        </w:rPr>
+        <w:t>Permitir a população compartilhar suas denúncias nas redes sociais.</w:t>
+      </w:r>
+    </w:p>
+    <w:p>
+      <w:pPr>
+        <w:pStyle w:val="NormalWeb"/>
+        <w:numPr>
+          <w:ilvl w:val="0"/>
+          <w:numId w:val="8"/>
+        </w:numPr>
+        <w:jc w:val="both"/>
+        <w:rPr>
+          <w:rFonts w:ascii="Arial" w:hAnsi="Arial" w:cs="Arial"/>
+          <w:sz w:val="28"/>
+          <w:szCs w:val="28"/>
+        </w:rPr>
+      </w:pPr>
+      <w:r>
+        <w:rPr>
+          <w:rFonts w:ascii="Arial" w:hAnsi="Arial" w:cs="Arial"/>
+          <w:sz w:val="28"/>
+          <w:szCs w:val="28"/>
+        </w:rPr>
+        <w:t>Permitir a população enviar fotos e vídeos da denúncia.</w:t>
+      </w:r>
+    </w:p>
+    <w:p>
+      <w:pPr>
+        <w:pStyle w:val="NormalWeb"/>
+        <w:numPr>
+          <w:ilvl w:val="0"/>
+          <w:numId w:val="8"/>
+        </w:numPr>
+        <w:jc w:val="both"/>
+        <w:rPr>
+          <w:rFonts w:ascii="Arial" w:hAnsi="Arial" w:cs="Arial"/>
+          <w:sz w:val="28"/>
+          <w:szCs w:val="28"/>
+        </w:rPr>
+      </w:pPr>
+      <w:r>
+        <w:rPr>
+          <w:rFonts w:ascii="Arial" w:hAnsi="Arial" w:cs="Arial"/>
+          <w:sz w:val="28"/>
+          <w:szCs w:val="28"/>
+        </w:rPr>
+        <w:t>Permitir a população informar o estado do processo (as respostas que obteve dos órgãos competentes).</w:t>
+      </w:r>
+    </w:p>
+    <w:p>
+      <w:pPr>
+        <w:pStyle w:val="NormalWeb"/>
+        <w:ind w:left="720"/>
         <w:jc w:val="both"/>
         <w:rPr>
           <w:rFonts w:ascii="Arial" w:hAnsi="Arial" w:cs="Arial"/>
@@ -1256,7 +1689,6 @@
           <w:bCs/>
           <w:szCs w:val="28"/>
         </w:rPr>
-        <w:lastRenderedPageBreak/>
         <w:t>REFERÊNCIAL TEÓRICO</w:t>
       </w:r>
     </w:p>
@@ -1271,8 +1703,8 @@
           <w:szCs w:val="24"/>
         </w:rPr>
       </w:pPr>
-      <w:bookmarkStart w:id="6" w:name="_Toc215588548"/>
-      <w:bookmarkStart w:id="7" w:name="_Hlk236231899"/>
+      <w:bookmarkStart w:id="7" w:name="_Toc215588548"/>
+      <w:bookmarkStart w:id="8" w:name="_Hlk236231899"/>
       <w:r>
         <w:rPr>
           <w:rFonts w:ascii="Arial" w:hAnsi="Arial" w:cs="Arial"/>
@@ -1303,9 +1735,9 @@
         </w:rPr>
         <w:t>Estudo da Viabilidade</w:t>
       </w:r>
-      <w:bookmarkEnd w:id="6"/>
-    </w:p>
-    <w:bookmarkEnd w:id="7"/>
+      <w:bookmarkEnd w:id="7"/>
+    </w:p>
+    <w:bookmarkEnd w:id="8"/>
     <w:p/>
     <w:p>
       <w:pPr>
@@ -1514,17 +1946,16 @@
           <w:szCs w:val="28"/>
         </w:rPr>
       </w:pPr>
-      <w:bookmarkStart w:id="8" w:name="_Toc215588549"/>
+      <w:bookmarkStart w:id="9" w:name="_Toc215588549"/>
       <w:r>
         <w:rPr>
           <w:rFonts w:cs="Arial"/>
           <w:bCs/>
           <w:szCs w:val="28"/>
         </w:rPr>
-        <w:lastRenderedPageBreak/>
         <w:t>3. METODOLOGIAS DE PESQUISA</w:t>
       </w:r>
-      <w:bookmarkEnd w:id="8"/>
+      <w:bookmarkEnd w:id="9"/>
     </w:p>
     <w:p>
       <w:pPr>
@@ -1539,7 +1970,7 @@
           <w:szCs w:val="24"/>
         </w:rPr>
       </w:pPr>
-      <w:bookmarkStart w:id="9" w:name="_Toc215588550"/>
+      <w:bookmarkStart w:id="10" w:name="_Toc215588550"/>
       <w:r>
         <w:rPr>
           <w:rFonts w:ascii="Arial" w:hAnsi="Arial" w:cs="Arial"/>
@@ -1570,7 +2001,7 @@
         </w:rPr>
         <w:t>Pesquisa de Campo</w:t>
       </w:r>
-      <w:bookmarkEnd w:id="9"/>
+      <w:bookmarkEnd w:id="10"/>
     </w:p>
     <w:p/>
     <w:p/>
@@ -1620,7 +2051,6 @@
           <w:color w:val="auto"/>
           <w:sz w:val="24"/>
         </w:rPr>
-        <w:lastRenderedPageBreak/>
         <w:t>3.2</w:t>
       </w:r>
       <w:r>
@@ -1692,17 +2122,16 @@
           <w:szCs w:val="28"/>
         </w:rPr>
       </w:pPr>
-      <w:bookmarkStart w:id="10" w:name="_Toc215588552"/>
+      <w:bookmarkStart w:id="11" w:name="_Toc215588552"/>
       <w:r>
         <w:rPr>
           <w:rFonts w:cs="Arial"/>
           <w:bCs/>
           <w:szCs w:val="28"/>
         </w:rPr>
-        <w:lastRenderedPageBreak/>
         <w:t>4. TECNOLOGIAS UTILIZADAS</w:t>
       </w:r>
-      <w:bookmarkEnd w:id="10"/>
+      <w:bookmarkEnd w:id="11"/>
     </w:p>
     <w:p>
       <w:pPr>
@@ -1715,8 +2144,8 @@
           <w:sz w:val="24"/>
         </w:rPr>
       </w:pPr>
-      <w:bookmarkStart w:id="11" w:name="_Toc215588553"/>
-      <w:bookmarkStart w:id="12" w:name="_Hlk207372423"/>
+      <w:bookmarkStart w:id="12" w:name="_Toc215588553"/>
+      <w:bookmarkStart w:id="13" w:name="_Hlk207372423"/>
       <w:r>
         <w:rPr>
           <w:rFonts w:ascii="Arial" w:hAnsi="Arial" w:cs="Arial"/>
@@ -1743,9 +2172,9 @@
         </w:rPr>
         <w:t>Linguagens</w:t>
       </w:r>
-      <w:bookmarkEnd w:id="11"/>
-    </w:p>
-    <w:bookmarkEnd w:id="12"/>
+      <w:bookmarkEnd w:id="12"/>
+    </w:p>
+    <w:bookmarkEnd w:id="13"/>
     <w:p/>
     <w:p>
       <w:pPr>
@@ -1759,7 +2188,7 @@
           <w:szCs w:val="28"/>
         </w:rPr>
       </w:pPr>
-      <w:bookmarkStart w:id="13" w:name="_Toc215588554"/>
+      <w:bookmarkStart w:id="14" w:name="_Toc215588554"/>
       <w:r>
         <w:rPr>
           <w:rFonts w:ascii="Arial" w:hAnsi="Arial" w:cs="Arial"/>
@@ -1770,7 +2199,7 @@
         </w:rPr>
         <w:t>4.1.1 HTML</w:t>
       </w:r>
-      <w:bookmarkEnd w:id="13"/>
+      <w:bookmarkEnd w:id="14"/>
     </w:p>
     <w:p>
       <w:pPr>
@@ -1785,7 +2214,7 @@
           <w:sz w:val="20"/>
         </w:rPr>
       </w:pPr>
-      <w:bookmarkStart w:id="14" w:name="_Toc215586063"/>
+      <w:bookmarkStart w:id="15" w:name="_Toc215586063"/>
       <w:r>
         <w:rPr>
           <w:rFonts w:cs="Arial"/>
@@ -1850,7 +2279,7 @@
         </w:rPr>
         <w:t xml:space="preserve"> - Logo HTML</w:t>
       </w:r>
-      <w:bookmarkEnd w:id="14"/>
+      <w:bookmarkEnd w:id="15"/>
     </w:p>
     <w:p>
       <w:pPr>
@@ -1884,7 +2313,7 @@
                       <a:picLocks noChangeAspect="1"/>
                       <a:extLst>
                         <a:ext uri="sm">
-                          <sm:smNativeData xmlns:sm="sm" xmlns:w="http://schemas.openxmlformats.org/wordprocessingml/2006/main" xmlns:w10="urn:schemas-microsoft-com:office:word" xmlns:v="urn:schemas-microsoft-com:vml" xmlns:o="urn:schemas-microsoft-com:office:office" xmlns="" xmlns:w16sdtfl="http://schemas.microsoft.com/office/word/2024/wordml/sdtformatlock" xmlns:w16sdtdh="http://schemas.microsoft.com/office/word/2020/wordml/sdtdatahash" xmlns:w16du="http://schemas.microsoft.com/office/word/2023/wordml/word16du" xmlns:w16="http://schemas.microsoft.com/office/word/2018/wordml" xmlns:w16cex="http://schemas.microsoft.com/office/word/2018/wordml/cex" xmlns:oel="http://schemas.microsoft.com/office/2019/extlst" val="SMDATA_16_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"/>
+                          <sm:smNativeData xmlns:oel="http://schemas.microsoft.com/office/2019/extlst" xmlns:w16cex="http://schemas.microsoft.com/office/word/2018/wordml/cex" xmlns:w16="http://schemas.microsoft.com/office/word/2018/wordml" xmlns:w16du="http://schemas.microsoft.com/office/word/2023/wordml/word16du" xmlns:w16sdtdh="http://schemas.microsoft.com/office/word/2020/wordml/sdtdatahash" xmlns:w16sdtfl="http://schemas.microsoft.com/office/word/2024/wordml/sdtformatlock" xmlns="" xmlns:o="urn:schemas-microsoft-com:office:office" xmlns:v="urn:schemas-microsoft-com:vml" xmlns:w10="urn:schemas-microsoft-com:office:word" xmlns:w="http://schemas.openxmlformats.org/wordprocessingml/2006/main" xmlns:sm="sm" val="SMDATA_16_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"/>
                         </a:ext>
                       </a:extLst>
                     </pic:cNvPicPr>
@@ -1976,6 +2405,7 @@
           <w:rFonts w:cs="Arial"/>
           <w:szCs w:val="24"/>
         </w:rPr>
+        <w:lastRenderedPageBreak/>
         <w:t>HTML (</w:t>
       </w:r>
       <w:proofErr w:type="spellStart"/>
@@ -2025,7 +2455,7 @@
           <w:szCs w:val="28"/>
         </w:rPr>
       </w:pPr>
-      <w:bookmarkStart w:id="15" w:name="_Toc215588555"/>
+      <w:bookmarkStart w:id="16" w:name="_Toc215588555"/>
       <w:r>
         <w:rPr>
           <w:rFonts w:ascii="Arial" w:hAnsi="Arial" w:cs="Arial"/>
@@ -2036,7 +2466,7 @@
         </w:rPr>
         <w:t>4.1.2 CSS</w:t>
       </w:r>
-      <w:bookmarkEnd w:id="15"/>
+      <w:bookmarkEnd w:id="16"/>
     </w:p>
     <w:p>
       <w:pPr>
@@ -2051,7 +2481,7 @@
           <w:sz w:val="20"/>
         </w:rPr>
       </w:pPr>
-      <w:bookmarkStart w:id="16" w:name="_Toc215586064"/>
+      <w:bookmarkStart w:id="17" w:name="_Toc215586064"/>
       <w:r>
         <w:rPr>
           <w:rFonts w:cs="Arial"/>
@@ -2116,7 +2546,7 @@
         </w:rPr>
         <w:t xml:space="preserve"> - Logo CSS</w:t>
       </w:r>
-      <w:bookmarkEnd w:id="16"/>
+      <w:bookmarkEnd w:id="17"/>
     </w:p>
     <w:p>
       <w:pPr>
@@ -2151,7 +2581,7 @@
                       <a:picLocks noChangeAspect="1"/>
                       <a:extLst>
                         <a:ext uri="sm">
-                          <sm:smNativeData xmlns:sm="sm" xmlns:w="http://schemas.openxmlformats.org/wordprocessingml/2006/main" xmlns:w10="urn:schemas-microsoft-com:office:word" xmlns:v="urn:schemas-microsoft-com:vml" xmlns:o="urn:schemas-microsoft-com:office:office" xmlns="" xmlns:w16sdtfl="http://schemas.microsoft.com/office/word/2024/wordml/sdtformatlock" xmlns:w16sdtdh="http://schemas.microsoft.com/office/word/2020/wordml/sdtdatahash" xmlns:w16du="http://schemas.microsoft.com/office/word/2023/wordml/word16du" xmlns:w16="http://schemas.microsoft.com/office/word/2018/wordml" xmlns:w16cex="http://schemas.microsoft.com/office/word/2018/wordml/cex" xmlns:oel="http://schemas.microsoft.com/office/2019/extlst" val="SMDATA_16_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"/>
+                          <sm:smNativeData xmlns:oel="http://schemas.microsoft.com/office/2019/extlst" xmlns:w16cex="http://schemas.microsoft.com/office/word/2018/wordml/cex" xmlns:w16="http://schemas.microsoft.com/office/word/2018/wordml" xmlns:w16du="http://schemas.microsoft.com/office/word/2023/wordml/word16du" xmlns:w16sdtdh="http://schemas.microsoft.com/office/word/2020/wordml/sdtdatahash" xmlns:w16sdtfl="http://schemas.microsoft.com/office/word/2024/wordml/sdtformatlock" xmlns="" xmlns:o="urn:schemas-microsoft-com:office:office" xmlns:v="urn:schemas-microsoft-com:vml" xmlns:w10="urn:schemas-microsoft-com:office:word" xmlns:w="http://schemas.openxmlformats.org/wordprocessingml/2006/main" xmlns:sm="sm" val="SMDATA_16_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"/>
                         </a:ext>
                       </a:extLst>
                     </pic:cNvPicPr>
@@ -2294,7 +2724,7 @@
           <w:szCs w:val="28"/>
         </w:rPr>
       </w:pPr>
-      <w:bookmarkStart w:id="17" w:name="_Toc215588556"/>
+      <w:bookmarkStart w:id="18" w:name="_Toc215588556"/>
       <w:r>
         <w:rPr>
           <w:rFonts w:ascii="Arial" w:hAnsi="Arial" w:cs="Arial"/>
@@ -2303,7 +2733,6 @@
           <w:color w:val="000000" w:themeColor="text1"/>
           <w:szCs w:val="28"/>
         </w:rPr>
-        <w:lastRenderedPageBreak/>
         <w:t xml:space="preserve">4.1.3 </w:t>
       </w:r>
       <w:proofErr w:type="spellStart"/>
@@ -2317,7 +2746,7 @@
         </w:rPr>
         <w:t>JavaScript</w:t>
       </w:r>
-      <w:bookmarkEnd w:id="17"/>
+      <w:bookmarkEnd w:id="18"/>
       <w:proofErr w:type="spellEnd"/>
     </w:p>
     <w:p>
@@ -2340,7 +2769,7 @@
           <w:sz w:val="20"/>
         </w:rPr>
       </w:pPr>
-      <w:bookmarkStart w:id="18" w:name="_Toc215586065"/>
+      <w:bookmarkStart w:id="19" w:name="_Toc215586065"/>
       <w:r>
         <w:rPr>
           <w:rFonts w:cs="Arial"/>
@@ -2415,7 +2844,7 @@
         </w:rPr>
         <w:t>JavaScript</w:t>
       </w:r>
-      <w:bookmarkEnd w:id="18"/>
+      <w:bookmarkEnd w:id="19"/>
       <w:proofErr w:type="spellEnd"/>
     </w:p>
     <w:p>
@@ -2539,6 +2968,7 @@
           <w:rFonts w:cs="Arial"/>
           <w:szCs w:val="24"/>
         </w:rPr>
+        <w:lastRenderedPageBreak/>
         <w:t xml:space="preserve">A linguagem de programação </w:t>
       </w:r>
       <w:proofErr w:type="spellStart"/>
@@ -2586,7 +3016,7 @@
           <w:szCs w:val="28"/>
         </w:rPr>
       </w:pPr>
-      <w:bookmarkStart w:id="19" w:name="_Toc215588557"/>
+      <w:bookmarkStart w:id="20" w:name="_Toc215588557"/>
       <w:r>
         <w:rPr>
           <w:rFonts w:ascii="Arial" w:hAnsi="Arial" w:cs="Arial"/>
@@ -2597,7 +3027,7 @@
         </w:rPr>
         <w:t>4.1.4 PHP</w:t>
       </w:r>
-      <w:bookmarkEnd w:id="19"/>
+      <w:bookmarkEnd w:id="20"/>
     </w:p>
     <w:p>
       <w:pPr>
@@ -2619,7 +3049,7 @@
           <w:sz w:val="20"/>
         </w:rPr>
       </w:pPr>
-      <w:bookmarkStart w:id="20" w:name="_Toc215586066"/>
+      <w:bookmarkStart w:id="21" w:name="_Toc215586066"/>
       <w:r>
         <w:rPr>
           <w:rFonts w:cs="Arial"/>
@@ -2694,7 +3124,7 @@
         </w:rPr>
         <w:t>Php</w:t>
       </w:r>
-      <w:bookmarkEnd w:id="20"/>
+      <w:bookmarkEnd w:id="21"/>
       <w:proofErr w:type="spellEnd"/>
     </w:p>
     <w:p>
@@ -2730,7 +3160,7 @@
                       <a:picLocks noChangeAspect="1"/>
                       <a:extLst>
                         <a:ext uri="sm">
-                          <sm:smNativeData xmlns:sm="sm" xmlns:w="http://schemas.openxmlformats.org/wordprocessingml/2006/main" xmlns:w10="urn:schemas-microsoft-com:office:word" xmlns:v="urn:schemas-microsoft-com:vml" xmlns:o="urn:schemas-microsoft-com:office:office" xmlns="" xmlns:w16sdtfl="http://schemas.microsoft.com/office/word/2024/wordml/sdtformatlock" xmlns:w16sdtdh="http://schemas.microsoft.com/office/word/2020/wordml/sdtdatahash" xmlns:w16du="http://schemas.microsoft.com/office/word/2023/wordml/word16du" xmlns:w16="http://schemas.microsoft.com/office/word/2018/wordml" xmlns:w16cex="http://schemas.microsoft.com/office/word/2018/wordml/cex" xmlns:oel="http://schemas.microsoft.com/office/2019/extlst" val="SMDATA_16_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"/>
+                          <sm:smNativeData xmlns:oel="http://schemas.microsoft.com/office/2019/extlst" xmlns:w16cex="http://schemas.microsoft.com/office/word/2018/wordml/cex" xmlns:w16="http://schemas.microsoft.com/office/word/2018/wordml" xmlns:w16du="http://schemas.microsoft.com/office/word/2023/wordml/word16du" xmlns:w16sdtdh="http://schemas.microsoft.com/office/word/2020/wordml/sdtdatahash" xmlns:w16sdtfl="http://schemas.microsoft.com/office/word/2024/wordml/sdtformatlock" xmlns="" xmlns:o="urn:schemas-microsoft-com:office:office" xmlns:v="urn:schemas-microsoft-com:vml" xmlns:w10="urn:schemas-microsoft-com:office:word" xmlns:w="http://schemas.openxmlformats.org/wordprocessingml/2006/main" xmlns:sm="sm" val="SMDATA_16_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"/>
                         </a:ext>
                       </a:extLst>
                     </pic:cNvPicPr>
@@ -2868,7 +3298,7 @@
           <w:szCs w:val="28"/>
         </w:rPr>
       </w:pPr>
-      <w:bookmarkStart w:id="21" w:name="_Toc215588558"/>
+      <w:bookmarkStart w:id="22" w:name="_Toc215588558"/>
       <w:r>
         <w:rPr>
           <w:rFonts w:ascii="Arial" w:hAnsi="Arial" w:cs="Arial"/>
@@ -2877,11 +3307,8 @@
           <w:color w:val="000000" w:themeColor="text1"/>
           <w:szCs w:val="28"/>
         </w:rPr>
-        <w:lastRenderedPageBreak/>
         <w:t>4.1.5 Java</w:t>
       </w:r>
-      <w:bookmarkStart w:id="22" w:name="_GoBack"/>
-      <w:bookmarkEnd w:id="21"/>
       <w:bookmarkEnd w:id="22"/>
     </w:p>
     <w:p>
@@ -3097,6 +3524,7 @@
           <w:rFonts w:eastAsia="Arial" w:cs="Arial"/>
           <w:szCs w:val="24"/>
         </w:rPr>
+        <w:lastRenderedPageBreak/>
         <w:t>Java é uma linguagem de programação extremamente versátil que pode ser usado para programar softwares e aplicativos para muitos sistemas operacionais e dispositivos diferentes.</w:t>
       </w:r>
     </w:p>
@@ -3497,6 +3925,119 @@
     </w:lvl>
   </w:abstractNum>
   <w:abstractNum w:abstractNumId="4" w15:restartNumberingAfterBreak="0">
+    <w:nsid w:val="38612337"/>
+    <w:multiLevelType w:val="hybridMultilevel"/>
+    <w:tmpl w:val="38E06378"/>
+    <w:lvl w:ilvl="0" w:tplc="04160001">
+      <w:start w:val="1"/>
+      <w:numFmt w:val="bullet"/>
+      <w:lvlText w:val=""/>
+      <w:lvlJc w:val="left"/>
+      <w:pPr>
+        <w:ind w:left="720" w:hanging="360"/>
+      </w:pPr>
+      <w:rPr>
+        <w:rFonts w:ascii="Symbol" w:hAnsi="Symbol" w:hint="default"/>
+      </w:rPr>
+    </w:lvl>
+    <w:lvl w:ilvl="1" w:tplc="04160003" w:tentative="1">
+      <w:start w:val="1"/>
+      <w:numFmt w:val="bullet"/>
+      <w:lvlText w:val="o"/>
+      <w:lvlJc w:val="left"/>
+      <w:pPr>
+        <w:ind w:left="1440" w:hanging="360"/>
+      </w:pPr>
+      <w:rPr>
+        <w:rFonts w:ascii="Courier New" w:hAnsi="Courier New" w:cs="Courier New" w:hint="default"/>
+      </w:rPr>
+    </w:lvl>
+    <w:lvl w:ilvl="2" w:tplc="04160005" w:tentative="1">
+      <w:start w:val="1"/>
+      <w:numFmt w:val="bullet"/>
+      <w:lvlText w:val=""/>
+      <w:lvlJc w:val="left"/>
+      <w:pPr>
+        <w:ind w:left="2160" w:hanging="360"/>
+      </w:pPr>
+      <w:rPr>
+        <w:rFonts w:ascii="Wingdings" w:hAnsi="Wingdings" w:hint="default"/>
+      </w:rPr>
+    </w:lvl>
+    <w:lvl w:ilvl="3" w:tplc="04160001" w:tentative="1">
+      <w:start w:val="1"/>
+      <w:numFmt w:val="bullet"/>
+      <w:lvlText w:val=""/>
+      <w:lvlJc w:val="left"/>
+      <w:pPr>
+        <w:ind w:left="2880" w:hanging="360"/>
+      </w:pPr>
+      <w:rPr>
+        <w:rFonts w:ascii="Symbol" w:hAnsi="Symbol" w:hint="default"/>
+      </w:rPr>
+    </w:lvl>
+    <w:lvl w:ilvl="4" w:tplc="04160003" w:tentative="1">
+      <w:start w:val="1"/>
+      <w:numFmt w:val="bullet"/>
+      <w:lvlText w:val="o"/>
+      <w:lvlJc w:val="left"/>
+      <w:pPr>
+        <w:ind w:left="3600" w:hanging="360"/>
+      </w:pPr>
+      <w:rPr>
+        <w:rFonts w:ascii="Courier New" w:hAnsi="Courier New" w:cs="Courier New" w:hint="default"/>
+      </w:rPr>
+    </w:lvl>
+    <w:lvl w:ilvl="5" w:tplc="04160005" w:tentative="1">
+      <w:start w:val="1"/>
+      <w:numFmt w:val="bullet"/>
+      <w:lvlText w:val=""/>
+      <w:lvlJc w:val="left"/>
+      <w:pPr>
+        <w:ind w:left="4320" w:hanging="360"/>
+      </w:pPr>
+      <w:rPr>
+        <w:rFonts w:ascii="Wingdings" w:hAnsi="Wingdings" w:hint="default"/>
+      </w:rPr>
+    </w:lvl>
+    <w:lvl w:ilvl="6" w:tplc="04160001" w:tentative="1">
+      <w:start w:val="1"/>
+      <w:numFmt w:val="bullet"/>
+      <w:lvlText w:val=""/>
+      <w:lvlJc w:val="left"/>
+      <w:pPr>
+        <w:ind w:left="5040" w:hanging="360"/>
+      </w:pPr>
+      <w:rPr>
+        <w:rFonts w:ascii="Symbol" w:hAnsi="Symbol" w:hint="default"/>
+      </w:rPr>
+    </w:lvl>
+    <w:lvl w:ilvl="7" w:tplc="04160003" w:tentative="1">
+      <w:start w:val="1"/>
+      <w:numFmt w:val="bullet"/>
+      <w:lvlText w:val="o"/>
+      <w:lvlJc w:val="left"/>
+      <w:pPr>
+        <w:ind w:left="5760" w:hanging="360"/>
+      </w:pPr>
+      <w:rPr>
+        <w:rFonts w:ascii="Courier New" w:hAnsi="Courier New" w:cs="Courier New" w:hint="default"/>
+      </w:rPr>
+    </w:lvl>
+    <w:lvl w:ilvl="8" w:tplc="04160005" w:tentative="1">
+      <w:start w:val="1"/>
+      <w:numFmt w:val="bullet"/>
+      <w:lvlText w:val=""/>
+      <w:lvlJc w:val="left"/>
+      <w:pPr>
+        <w:ind w:left="6480" w:hanging="360"/>
+      </w:pPr>
+      <w:rPr>
+        <w:rFonts w:ascii="Wingdings" w:hAnsi="Wingdings" w:hint="default"/>
+      </w:rPr>
+    </w:lvl>
+  </w:abstractNum>
+  <w:abstractNum w:abstractNumId="5" w15:restartNumberingAfterBreak="0">
     <w:nsid w:val="3EE222A2"/>
     <w:multiLevelType w:val="multilevel"/>
     <w:tmpl w:val="C0CCDEEC"/>
@@ -3609,7 +4150,7 @@
       </w:rPr>
     </w:lvl>
   </w:abstractNum>
-  <w:abstractNum w:abstractNumId="5" w15:restartNumberingAfterBreak="0">
+  <w:abstractNum w:abstractNumId="6" w15:restartNumberingAfterBreak="0">
     <w:nsid w:val="482E4B68"/>
     <w:multiLevelType w:val="multilevel"/>
     <w:tmpl w:val="30B27F78"/>
@@ -3722,7 +4263,7 @@
       </w:rPr>
     </w:lvl>
   </w:abstractNum>
-  <w:abstractNum w:abstractNumId="6" w15:restartNumberingAfterBreak="0">
+  <w:abstractNum w:abstractNumId="7" w15:restartNumberingAfterBreak="0">
     <w:nsid w:val="571338F6"/>
     <w:multiLevelType w:val="hybridMultilevel"/>
     <w:tmpl w:val="61883CCE"/>
@@ -3815,7 +4356,7 @@
     <w:abstractNumId w:val="0"/>
   </w:num>
   <w:num w:numId="2">
-    <w:abstractNumId w:val="4"/>
+    <w:abstractNumId w:val="5"/>
   </w:num>
   <w:num w:numId="3">
     <w:abstractNumId w:val="3"/>
@@ -3824,13 +4365,16 @@
     <w:abstractNumId w:val="1"/>
   </w:num>
   <w:num w:numId="5">
-    <w:abstractNumId w:val="5"/>
+    <w:abstractNumId w:val="6"/>
   </w:num>
   <w:num w:numId="6">
     <w:abstractNumId w:val="2"/>
   </w:num>
   <w:num w:numId="7">
-    <w:abstractNumId w:val="6"/>
+    <w:abstractNumId w:val="7"/>
+  </w:num>
+  <w:num w:numId="8">
+    <w:abstractNumId w:val="4"/>
   </w:num>
 </w:numbering>
 </file>
@@ -4337,6 +4881,7 @@
   </w:style>
   <w:style w:type="character" w:customStyle="1" w:styleId="Ttulo1Char">
     <w:name w:val="Título 1 Char"/>
+    <w:aliases w:val="TITULO Char"/>
     <w:basedOn w:val="Fontepargpadro"/>
     <w:link w:val="Ttulo1"/>
     <w:rsid w:val="002D6335"/>

</xml_diff>